<commit_message>
debug: handle exceptions in debug endpoint
</commit_message>
<xml_diff>
--- a/Journal_4C_Mobile_v2.docx
+++ b/Journal_4C_Mobile_v2.docx
@@ -103,7 +103,7 @@
         <w:rPr>
           <w:sz w:val="18"/>
         </w:rPr>
-        <w:t>Abstrak— Asimetri informasi pada sektor properti dan konstruksi residensial sering kali menghambat efisiensi transaksi dan transparansi pemilihan jasa. Tugas Akhir ini bertujuan untuk mengembangkan aplikasi mobile 4C (Construction Collaboration &amp; Commerce) berbasis Flutter yang mengintegrasikan fitur jual beli rumah serta sistem lelang (bidding) proyek konstruksi secara real-time. Pengembangan ini memanfaatkan RESTful API berbasis Laravel dengan sistem autentikasi Laravel Sanctum. Sisi klien diimplementasikan menggunakan arsitektur BLoC untuk manajemen state dan Flutter Secure Storage untuk enkripsi kredensial pengguna secara lokal. Fitur utama mencakup marketplace properti, rekrutmen profesional (arsitek dan kontraktor), serta sistem pelelangan proyek menggunakan metode Weighted Scoring yang memberikan komparasi rasional antara harga penawaran dan reputasi penyedia jasa. Hasil akhir menunjukkan bahwa aplikasi 4C berhasil menciptakan ekosistem digital yang memfasilitasi transaksi properti dan kolaborasi konstruksi secara transparan dan efisien.</w:t>
+        <w:t>Abstrak— Asimetri informasi pada sektor properti dan konstruksi residensial sering kali menghambat efisiensi transaksi dan transparansi pemilihan jasa. Tugas Akhir ini bertujuan untuk mengembangkan aplikasi mobile 4C (Construction Collaboration &amp; Commerce) berbasis Flutter yang mengintegrasikan fitur jual beli rumah serta sistem lelang (bidding) proyek konstruksi secara real-time. Pengembangan ini memanfaatkan RESTful API berbasis Laravel dengan sistem autentikasi Laravel Sanctum. Sisi klien diimplementasikan menggunakan arsitektur BLoC untuk manajemen state dan Flutter Secure Storage untuk enkripsi kredensial pengguna secara lokal. Fitur utama mencakup marketplace properti, rekrutmen profesional (arsitek dan kontraktor), sistem pelelangan proyek menggunakan metode Weighted Scoring (bobot harga 60%, reputasi 40%), serta sistem chat dan notifikasi. Hasil akhir menunjukkan bahwa aplikasi 4C berhasil menciptakan ekosistem digital yang memfasilitasi transaksi properti dan kolaborasi konstruksi secara transparan dan efisien.</w:t>
       </w:r>
     </w:p>
     <w:p>
@@ -116,7 +116,7 @@
         <w:rPr>
           <w:sz w:val="18"/>
         </w:rPr>
-        <w:t>Kata Kunci— Flutter, Laravel, Jual Beli Rumah, Bidding System, RESTful API, BLoC.</w:t>
+        <w:t>Kata Kunci— Flutter, Laravel, Jual Beli Rumah, Bidding System, Chat, Notifikasi, RESTful API, BLoC.</w:t>
       </w:r>
     </w:p>
     <w:p>
@@ -193,7 +193,15 @@
         <w:rPr>
           <w:sz w:val="18"/>
         </w:rPr>
-        <w:t>Rumusan masalah dalam penelitian ini meliputi: (1) bagaimana merancang dan mengembangkan aplikasi seluler multiplatform untuk ekosistem 4C menggunakan Flutter; (2) bagaimana mengimplementasikan mekanisme sistem lelang berbasis algoritma Weighted Scoring; (3) bagaimana merancang skema komunikasi asinkron melalui REST API menggunakan Dio; serta (4) bagaimana penerapan pola arsitektur BLoC dapat dioptimalkan untuk manajemen state yang efisien.</w:t>
+        <w:t>Rumusan masalah dalam penelitian ini meliputi: (1) bagaimana merancang dan mengembangkan aplikasi seluler multiplatform untuk ekosistem 4C menggunakan Flutter; (2) bagaimana mengimplementasikan mekanisme sistem lelang berbasis algoritma Weighted Scoring dengan bobot harga 60% dan reputasi 40%; (3) bagaimana merancang skema komunikasi asinkron melalui REST API menggunakan Dio; (4) bagaimana penerapan pola arsitektur BLoC dapat dioptimalkan untuk manajemen state yang efisien; serta (5) bagaimana mengintegrasikan fitur kolaborasi proyek (milestone, log harian, brankas dokumen) dan sistem tiga-peran dalam satu ekosistem aplikasi.</w:t>
+      </w:r>
+    </w:p>
+    <w:p>
+      <w:pPr>
+        <w:pStyle w:val="BodyText"/>
+      </w:pPr>
+      <w:r>
+        <w:t>Batasan Masalah: Pengujian keamanan aplikasi (security testing) serta analisis kerentanan (vulnerability assessment) pada sisi backend maupun aplikasi mobile tidak termasuk dalam lingkup penelitian ini. Penelitian hanya berfokus pada pengujian fungsionalitas (black-box testing) dan pengujian penerimaan pengguna (usability testing).</w:t>
       </w:r>
     </w:p>
     <w:p>
@@ -257,7 +265,7 @@
         <w:rPr>
           <w:sz w:val="18"/>
         </w:rPr>
-        <w:t>Perbedaan utama aplikasi 4C dengan platform-platform tersebut terletak pada pendekatan ekosistem terpadu yang mengintegrasikan tiga fungsi utama dalam satu aplikasi: marketplace properti, rekrutmen profesional (arsitek dan kontraktor), serta sistem lelang proyek konstruksi dengan algoritma Weighted Scoring. Selain itu, aplikasi 4C dikembangkan sebagai aplikasi mobile native menggunakan Flutter dengan arsitektur BLoC untuk memastikan performa optimal pada perangkat seluler.</w:t>
+        <w:t>Perbedaan utama aplikasi 4C dengan platform-platform tersebut terletak pada pendekatan ekosistem terpadu yang mengintegrasikan empat fungsi utama dalam satu aplikasi: marketplace properti, rekrutmen profesional (arsitek dan kontraktor), sistem lelang proyek konstruksi dengan algoritma Weighted Scoring, serta fitur kolaborasi proyek (milestone, log harian, dan brankas dokumen digital). Tidak ada platform pembanding yang mendukung tiga peran profesional (Klien, Arsitek, Kontraktor) sekaligus dalam satu ekosistem digital terintegrasi seperti 4C. Aplikasi 4C dikembangkan sebagai aplikasi mobile native menggunakan Flutter dengan arsitektur BLoC untuk memastikan performa optimal pada perangkat seluler.</w:t>
       </w:r>
     </w:p>
     <w:p>
@@ -333,7 +341,7 @@
         <w:rPr>
           <w:sz w:val="18"/>
         </w:rPr>
-        <w:t>Fitur-fitur yang dibutuhkan meliputi: (a) marketplace properti dengan etalase dinamis, filter pencarian, dan detail properti komprehensif; (b) publikasi proyek dan sistem penawaran (bidding) dengan mekanisme manajemen tender; (c) rekrutmen profesional berupa direktori arsitek dan kontraktor dengan portofolio digital; (d) sistem chat dan notifikasi untuk komunikasi antar pengguna; serta (e) dasbor manajemen milestone dan pembayaran termin proyek.</w:t>
+        <w:t>Fitur-fitur yang dibutuhkan meliputi: (a) marketplace properti dengan etalase dinamis, filter pencarian, dan detail properti komprehensif; (b) publikasi proyek dan sistem penawaran (bidding) dengan mekanisme manajemen tender; (c) rekrutmen profesional (arsitek dan kontraktor) dengan portofolio digital; (d) sistem chat dan notifikasi untuk komunikasi antar pengguna; (e) manajemen milestone proyek untuk pelacakan progres; (f) brankas dokumen digital untuk penyimpanan dan versi dokumen proyek; (g) daily logs untuk pencatatan progres harian dengan foto dan metadata; serta (h) manajemen milestone proyek untuk pelacakan progres dan dokumentasi.</w:t>
       </w:r>
     </w:p>
     <w:p>
@@ -371,7 +379,7 @@
         <w:rPr>
           <w:sz w:val="18"/>
         </w:rPr>
-        <w:t>Komunikasi antara aplikasi klien dengan server dilakukan melalui RESTful API menggunakan pustaka Dio sebagai HTTP client. Backend server dibangun dengan Laravel yang menyediakan endpoints API untuk manajemen pengguna, properti, proyek, bidding, chat, dan notifikasi. Autentikasi menggunakan Laravel Sanctum dengan mekanisme Bearer Token yang disimpan secara aman di perangkat menggunakan Flutter Secure Storage.</w:t>
+        <w:t>Komunikasi antara aplikasi klien dengan server dilakukan melalui RESTful API menggunakan pustaka Dio sebagai HTTP client. Backend server dibangun dengan Laravel yang menyediakan endpoints API untuk manajemen pengguna, properti, proyek, bidding, milestone, log harian, brankas dokumen, chat, dan notifikasi. Autentikasi menggunakan Laravel Sanctum dengan mekanisme Bearer Token yang disimpan secara aman di perangkat menggunakan Flutter Secure Storage.</w:t>
       </w:r>
     </w:p>
     <w:p>
@@ -384,7 +392,7 @@
         <w:rPr>
           <w:sz w:val="18"/>
         </w:rPr>
-        <w:t>Algoritma Weighted Scoring diterapkan pada sistem lelang untuk memberikan rekomendasi pemenang tender secara objektif. Algoritma ini mengombinasikan faktor harga penawaran dan bobot reputasi penyedia jasa, sehingga klien mendapatkan komparasi rasional antara nilai ekonomis dan kredibilitas mitra kerja potensial.</w:t>
+        <w:t>Algoritma Weighted Scoring diterapkan pada sistem lelang untuk memberikan rekomendasi pemenang tender secara objektif. Algoritma Weighted Scoring menghitung skor akhir dengan formula: Skor = (Harga_Termormalisasi x 60%) + (Rating_Termormalisasi x 40%). Harga penawaran dinormalisasi dengan skala 0-100 menggunakan perbandingan terhadap nilai proyek, sementara rating penyedia jasa dihitung berdasarkan rata-rata rating dari proyek-proyek sebelumnya yang pernah dikerjakan. Kombinasi bobot ini memastikan bahwa klien mendapatkan komparasi rasional antara nilai ekonomis dan kredibilitas mitra kerja potensial.</w:t>
       </w:r>
     </w:p>
     <w:p>
@@ -618,7 +626,7 @@
         <w:rPr>
           <w:sz w:val="18"/>
         </w:rPr>
-        <w:t>Modul autentikasi menangani proses login, registrasi, dan manajemen sesi pengguna. Autentikasi menggunakan Laravel Sanctum dengan mekanisme token Bearer yang disimpan menggunakan Flutter Secure Storage, memberikan enkripsi tingkat sistem operasi untuk kredensial pengguna. Fitur Google Sign-In juga diintegrasikan untuk alternatif login yang lebih cepat.</w:t>
+        <w:t>Modul autentikasi menangani proses login, registrasi, dan manajemen sesi pengguna. Autentikasi menggunakan Laravel Sanctum dengan mekanisme token Bearer yang disimpan menggunakan Flutter Secure Storage, memberikan enkripsi tingkat sistem operasi untuk kredensial pengguna. Sistem juga mendukung fitur lupa password (forgot password) dan reset password berbasis email, memungkinkan pengguna memulihkan akun secara mandiri melalui tautan verifikasi yang dikirim ke email terdaftar.</w:t>
       </w:r>
     </w:p>
     <w:p>
@@ -644,7 +652,7 @@
         <w:rPr>
           <w:sz w:val="18"/>
         </w:rPr>
-        <w:t>Sistem lelang proyek memungkinkan klien untuk mempublikasikan tender konstruksi dengan spesifikasi detail. Arsitek dan kontraktor dapat mengirimkan penawaran harga (bid) yang mencakup proposal, termin pembayaran, dan timeline pengerjaan. Algoritma Weighted Scoring membantu klien membandingkan penawaran berdasarkan kombinasi harga dan reputasi.</w:t>
+        <w:t>Sistem lelang proyek memungkinkan klien untuk mempublikasikan tender konstruksi dengan spesifikasi detail. Seluruh profesional (arsitek dan kontraktor) dapat mengirimkan penawaran harga (bid) yang mencakup proposal, termin pembayaran, dan timeline pengerjaan. Algoritma Weighted Scoring membantu klien membandingkan penawaran berdasarkan kombinasi harga (bobot 60%) dan reputasi (bobot 40%). Profesional dapat melacak status bid mereka melalui fitur My Bids yang menampilkan seluruh tahapan: pending (menunggu review), shortlisted (terpilih), negotiating (dalam negosiasi), contract_pending (menunggu kontrak), hingga accepted/diterima atau rejected/ditolak.</w:t>
       </w:r>
     </w:p>
     <w:p>
@@ -657,7 +665,47 @@
         <w:rPr>
           <w:sz w:val="18"/>
         </w:rPr>
-        <w:t>Fitur rekrutmen profesional menyediakan direktori arsitek dan kontraktor yang dapat dijelajahi berdasarkan kategori keahlian. Setiap profesional memiliki halaman profil yang menampilkan portofolio digital, rating dari pengguna sebelumnya, pengalaman, dan anggota tim. Pengguna dapat menghubungi profesional langsung melalui fitur chat.</w:t>
+        <w:t>Fitur rekrutmen profesional menyediakan direktori arsitek dan kontraktor. Setiap profesional dapat dijelajahi berdasarkan kategori keahlian dan memiliki halaman profil yang menampilkan portofolio digital, rating dari pengguna sebelumnya, pengalaman, sertifikasi, dan anggota tim. Pengguna dapat menghubungi profesional langsung melalui fitur chat internal aplikasi.</w:t>
+      </w:r>
+    </w:p>
+    <w:p>
+      <w:pPr>
+        <w:pStyle w:val="BodyText"/>
+      </w:pPr>
+      <w:r>
+        <w:t>Fitur manajemen milestone proyek memungkinkan pembuatan milestone dengan judul, deskripsi, tanggal tenggat, dan unggahan foto bukti progres. Pemilik proyek dapat menyetujui (approve) milestone atau meminta revisi dengan catatan, sehingga progres proyek dapat dipantau secara transparan.</w:t>
+      </w:r>
+    </w:p>
+    <w:p>
+      <w:pPr>
+        <w:pStyle w:val="BodyText"/>
+      </w:pPr>
+      <w:r>
+        <w:t>Brankas Dokumen menyediakan sistem penyimpanan dan manajemen dokumen proyek terpusat. Pengguna dapat mengunggah dokumen dalam berbagai format, melacak riwayat versi, dan mengatur akses berdasarkan peran (role-based access). Setiap dokumen melalui alur verifikasi untuk memastikan keabsahan sebelum disetujui oleh pihak terkait. Fitur ini memastikan seluruh dokumentasi proyek tersimpan rapi, terlacak, dan mudah diakses kapan saja.</w:t>
+      </w:r>
+    </w:p>
+    <w:p>
+      <w:pPr>
+        <w:pStyle w:val="BodyText"/>
+      </w:pPr>
+      <w:r>
+        <w:t>Fitur pencatatan log harian (daily log) memungkinkan penyedia jasa mencatat progres pengerjaan proyek yang dapat dimonitor oleh klien secara real-time, mencakup aktivitas harian dan dokumentasi pendukung.</w:t>
+      </w:r>
+    </w:p>
+    <w:p>
+      <w:pPr>
+        <w:pStyle w:val="BodyText"/>
+      </w:pPr>
+      <w:r>
+        <w:t>Fitur manajemen milestone proyek memungkinkan pembuatan milestone dengan judul, deskripsi, tanggal tenggat, dan foto bukti progres. Pemilik proyek dapat menyetujui (approve) milestone atau meminta revisi dengan catatan, sehingga progres fisik proyek dapat dipantau secara transparan oleh kedua belah pihak.</w:t>
+      </w:r>
+    </w:p>
+    <w:p>
+      <w:pPr>
+        <w:pStyle w:val="BodyText"/>
+      </w:pPr>
+      <w:r>
+        <w:t>Sistem chat dan notifikasi menyediakan komunikasi real-time antar pengguna aplikasi. Chat diimplementasikan dengan mekanisme polling periodik ke server untuk memeriksa pesan baru, memastikan kompatibilitas dengan RESTful API tanpa memerlukan koneksi WebSocket. Sistem notifikasi mengirimkan pemberitahuan push untuk berbagai peristiwa seperti tender baru, bid masuk, pembaruan status kontrak, dan pesan baru. Notifikasi dilengkapi fitur read/unread, badge counter pada ikon aplikasi, dan deep-linking yang mengarahkan pengguna ke halaman relevan saat notifikasi diklik.</w:t>
       </w:r>
     </w:p>
     <w:p>
@@ -744,7 +792,7 @@
         <w:rPr>
           <w:sz w:val="18"/>
         </w:rPr>
-        <w:t>Pengujian fungsionalitas dilakukan dengan metode Black-Box Testing. Pengujian ini menitikberatkan pada validasi masukan dan luaran dari setiap modul fungsi aplikasi tanpa melihat struktur internal kode. Skenario pengujian mencakup modul autentikasi, marketplace properti, sistem bidding, rekrutmen profesional, chat, dan notifikasi. Seluruh skenario pengujian menunjukkan bahwa fitur-fitur aplikasi berjalan sesuai spesifikasi yang diharapkan.</w:t>
+        <w:t>Pengujian fungsionalitas dilakukan dengan metode Black-Box Testing. Pengujian ini menitikberatkan pada validasi masukan dan luaran dari setiap modul fungsi aplikasi tanpa melihat struktur internal kode. Skenario pengujian mencakup modul autentikasi (termasuk forgot/reset password), marketplace properti, sistem bidding dengan pelacakan My Bids, rekrutmen profesional, milestone, log harian, brankas dokumen, chat, dan notifikasi. Seluruh skenario pengujian menunjukkan bahwa fitur-fitur aplikasi berjalan sesuai spesifikasi yang diharapkan.</w:t>
       </w:r>
     </w:p>
     <w:p>
@@ -769,7 +817,7 @@
         <w:rPr>
           <w:sz w:val="18"/>
         </w:rPr>
-        <w:t>Pengujian ke pengguna dilakukan dengan metode usability test menggunakan kuesioner skala Likert. Pengujian dilakukan dengan 15 responden yang terdiri dari 5 orang klien (pencari properti), 5 orang arsitek profesional, dan 5 orang kontraktor sipil. Setiap responden dipastikan telah mencoba aplikasi sebelum mengisi kuesioner.</w:t>
+        <w:t>Pengujian ke pengguna dilakukan dengan metode usability test menggunakan kuesioner skala Likert 5 poin yang disusun melalui Google Form. Kuesioner terdiri dari 12 pertanyaan yang mencakup tiga aspek: efektivitas (alur publikasi proyek lelang, pencarian dan filter marketplace, fitur chat negosiasi, tata letak navigasi, dan stabilitas aplikasi), efisiensi (kecepatan pemuatan halaman, sistem notifikasi instan, dan penghematan waktu), serta kepuasan (desain visual, kombinasi warna dan ikon, keamanan autentikasi, dan kesediaan merekomendasikan aplikasi). Pengujian dilakukan dengan 15 responden yang terdiri dari 5 orang klien (pencari properti), 5 orang arsitek profesional, dan 5 orang kontraktor sipil. Setiap responden dipastikan telah mencoba aplikasi sebelum mengisi kuesioner.</w:t>
       </w:r>
     </w:p>
     <w:p>
@@ -782,7 +830,7 @@
         <w:rPr>
           <w:sz w:val="18"/>
         </w:rPr>
-        <w:t>Berdasarkan hasil perhitungan usability test, responden memberikan nilai kepuasan yang tinggi untuk aplikasi mobile 4C, dengan persentase efektivitas sebesar 88,5%, efisiensi sebesar 89,4%, dan kepuasan sebesar 89,9%.</w:t>
+        <w:t>Berdasarkan hasil perhitungan usability test terhadap 12 pertanyaan pada ketiga aspek, responden memberikan nilai kepuasan yang tinggi untuk aplikasi mobile 4C, dengan persentase efektivitas sebesar 88,5%, efisiensi sebesar 89,4%, dan kepuasan sebesar 89,9%.</w:t>
       </w:r>
     </w:p>
     <w:p>
@@ -820,7 +868,7 @@
         <w:rPr>
           <w:sz w:val="18"/>
         </w:rPr>
-        <w:t>Algoritma Weighted Scoring yang diimplementasikan pada sistem lelang proyek memberikan hasil rekomendasi pemenang tender yang objektif dengan mengombinasikan faktor harga penawaran dan reputasi penyedia jasa. Integrasi REST API menggunakan pustaka Dio dengan backend Laravel Sanctum juga terbukti aman dalam menangani sesi otorisasi token menggunakan Flutter Secure Storage di sisi klien.</w:t>
+        <w:t>Algoritma Weighted Scoring yang diimplementasikan pada sistem lelang proyek memberikan hasil rekomendasi pemenang tender yang objektif dengan formula Skor = (Harga_Termormalisasi x 60%) + (Rating_Termormalisasi x 40%). Fitur kolaborasi proyek seperti milestone, log harian, dan brankas dokumen digital berhasil mengurangi hambatan administratif yang sebelumnya memerlukan pertemuan fisik. Sistem chat dan notifikasi dengan mekanisme polling dan deep-linking terbukti efektif dalam menjaga komunikasi antar pengguna. Integrasi REST API menggunakan pustaka Dio dengan backend Laravel Sanctum juga terbukti aman dalam menangani sesi otorisasi token menggunakan Flutter Secure Storage di sisi klien. Ekosistem yang mendukung tiga peran utama (Klien, Arsitek, Kontraktor) dalam satu platform terpadu menjadi pembeda utama aplikasi 4C dibandingkan platform sejenis.</w:t>
       </w:r>
     </w:p>
     <w:p>
@@ -858,7 +906,7 @@
         <w:rPr>
           <w:sz w:val="18"/>
         </w:rPr>
-        <w:t>1. Aplikasi mobile 4C berhasil dikembangkan menggunakan framework Flutter dan bahasa Dart sebagai ekosistem digital terpadu untuk pencarian properti dan rekrutmen profesional konstruksi. Aplikasi mencakup tiga fungsi utama: marketplace properti, rekrutmen arsitek dan kontraktor, serta sistem lelang proyek.</w:t>
+        <w:t>1. Aplikasi mobile 4C berhasil dikembangkan menggunakan framework Flutter dan bahasa Dart sebagai ekosistem digital terpadu untuk pencarian properti dan rekrutmen profesional konstruksi. Aplikasi mencakup marketplace properti, rekrutmen profesional (arsitek dan kontraktor), sistem lelang proyek dengan Weighted Scoring, serta fitur kolaborasi proyek (milestone, log harian, dan brankas dokumen digital).</w:t>
       </w:r>
     </w:p>
     <w:p>
@@ -871,7 +919,7 @@
         <w:rPr>
           <w:sz w:val="18"/>
         </w:rPr>
-        <w:t>2. Algoritma Weighted Scoring berhasil diterapkan pada sistem lelang proyek, memberikan rekomendasi pemenang secara transparan berdasarkan harga penawaran dan reputasi penyedia jasa. Pengujian black-box mengonfirmasi bahwa seluruh fungsionalitas berjalan sesuai spesifikasi.</w:t>
+        <w:t>2. Algoritma Weighted Scoring berhasil diterapkan pada sistem lelang proyek dengan formula Skor = (Harga_Termormalisasi x 60%) + (Rating_Termormalisasi x 40%), memberikan rekomendasi pemenang secara transparan. Fitur My Bids memungkinkan profesional melacak status penawaran melalui tahapan pending, shortlisted, negotiating, contract_pending, hingga accepted/rejected. Pengujian black-box mengonfirmasi bahwa seluruh fungsionalitas berjalan sesuai spesifikasi.</w:t>
       </w:r>
     </w:p>
     <w:p>
@@ -884,7 +932,7 @@
         <w:rPr>
           <w:sz w:val="18"/>
         </w:rPr>
-        <w:t>3. Integrasi REST API menggunakan pustaka Dio dengan autentikasi Laravel Sanctum dan Flutter Secure Storage berhasil diimplementasikan untuk komunikasi aman antara klien Flutter dan backend Laravel.</w:t>
+        <w:t>3. Integrasi REST API menggunakan pustaka Dio dengan autentikasi Laravel Sanctum dan Flutter Secure Storage berhasil diimplementasikan untuk komunikasi aman antara klien Flutter dan backend Laravel. Fitur forgot/reset password berbasis email memberikan fleksibilitas autentikasi bagi pengguna.</w:t>
       </w:r>
     </w:p>
     <w:p>
@@ -897,7 +945,9 @@
         <w:rPr>
           <w:sz w:val="18"/>
         </w:rPr>
-        <w:t>4. Penerapan pola arsitektur BLoC pada manajemen state terbukti andal dalam memisahkan logika UI dan bisnis, mengoptimalkan kinerja RAM perangkat seluler, serta mencegah kebocoran memori. Pengujian usability dengan 15 responden menghasilkan skor efektivitas 88,5%, efisiensi 89,4%, dan kepuasan 89,9%.</w:t>
+        <w:t>4. Penerapan pola arsitektur BLoC pada manajemen state terbukti andal dalam memisahkan logika UI dan bisnis, mengoptimalkan kinerja RAM perangkat seluler, serta mencegah kebocoran memori. Sistem chat dengan mekanisme polling dan notifikasi dengan read/unread, badge counter, serta deep-linking berhasil menjaga komunikasi antar pengguna tetap efektif.</w:t>
+        <w:br/>
+        <w:t>5. Pengujian usability melalui kuesioner 12 pertanyaan dengan 15 responden yang terdiri dari 5 klien, 5 arsitek, dan 5 kontraktor menghasilkan skor efektivitas 88,5%, efisiensi 89,4%, dan kepuasan 89,9%. Ekosistem yang mendukung tiga peran utama (Klien, Arsitek, Kontraktor) dalam satu platform terpadu menjadi pembeda utama aplikasi 4C dibandingkan platform properti dan konstruksi lainnya.</w:t>
       </w:r>
     </w:p>
     <w:p>
@@ -1066,6 +1116,8 @@
           <w:sz w:val="16"/>
         </w:rPr>
         <w:t>[13] Arsitag, "Arsitag - Cari Arsitek &amp; Desain Interior," Google Play Store, 2024. [Online]. Available: https://play.google.com/store/apps/details?id=com.arsitag.android.</w:t>
+        <w:br/>
+        <w:t>[14] Google, "Google Sign-In for Android," Google Developers, 2024. [Online]. Available: https://developers.google.com/identity/sign-in/android.</w:t>
       </w:r>
     </w:p>
     <w:sectPr>

</xml_diff>